<commit_message>
Add Table of Contents page to book manuscript
</commit_message>
<xml_diff>
--- a/AI_for_Everyone_by_Alok_Maurya.docx
+++ b/AI_for_Everyone_by_Alok_Maurya.docx
@@ -100,6 +100,507 @@
       </w:pPr>
       <w:r>
         <w:br w:type="page"/>
+      </w:r>
+    </w:p>
+    <w:p>
+      <w:pPr>
+        <w:spacing w:after="0" w:before="0"/>
+      </w:pPr>
+      <w:r>
+        <w:br w:type="page"/>
+      </w:r>
+    </w:p>
+    <w:p>
+      <w:pPr>
+        <w:spacing w:after="60" w:before="480"/>
+        <w:jc w:val="center"/>
+      </w:pPr>
+      <w:r>
+        <w:rPr>
+          <w:rFonts w:ascii="Arial" w:cs="Arial" w:eastAsia="Arial" w:hAnsi="Arial"/>
+          <w:b/>
+          <w:bCs/>
+          <w:caps/>
+          <w:color w:val="1A1A2E"/>
+          <w:sz w:val="36"/>
+          <w:szCs w:val="36"/>
+        </w:rPr>
+        <w:t xml:space="preserve">TABLE OF CONTENTS</w:t>
+      </w:r>
+    </w:p>
+    <w:p>
+      <w:pPr>
+        <w:spacing w:after="480" w:before="0"/>
+        <w:jc w:val="center"/>
+      </w:pPr>
+      <w:r>
+        <w:rPr>
+          <w:rFonts w:ascii="Arial" w:cs="Arial" w:eastAsia="Arial" w:hAnsi="Arial"/>
+          <w:color w:val="C0C8D4"/>
+          <w:sz w:val="20"/>
+          <w:szCs w:val="20"/>
+        </w:rPr>
+        <w:t xml:space="preserve">─────────────────────────────────────────────────</w:t>
+      </w:r>
+    </w:p>
+    <w:p>
+      <w:pPr>
+        <w:spacing w:after="40" w:before="80"/>
+        <w:ind w:left="360"/>
+      </w:pPr>
+      <w:r>
+        <w:rPr>
+          <w:rFonts w:ascii="Georgia" w:cs="Georgia" w:eastAsia="Georgia" w:hAnsi="Georgia"/>
+          <w:b w:val="false"/>
+          <w:bCs w:val="false"/>
+          <w:color w:val="444444"/>
+          <w:sz w:val="20"/>
+          <w:szCs w:val="20"/>
+        </w:rPr>
+        <w:t xml:space="preserve">  Introduction</w:t>
+      </w:r>
+      <w:r>
+        <w:rPr>
+          <w:rFonts w:ascii="Arial" w:cs="Arial" w:eastAsia="Arial" w:hAnsi="Arial"/>
+          <w:b w:val="false"/>
+          <w:bCs w:val="false"/>
+          <w:color w:val="444444"/>
+          <w:sz w:val="20"/>
+          <w:szCs w:val="20"/>
+        </w:rPr>
+        <w:ptab w:alignment="right" w:relativeTo="margin" w:leader="dot"/>
+        <w:t xml:space="preserve">2</w:t>
+      </w:r>
+    </w:p>
+    <w:p>
+      <w:pPr>
+        <w:spacing w:after="120" w:before="0"/>
+      </w:pPr>
+      <w:r>
+        <w:t xml:space="preserve"/>
+      </w:r>
+    </w:p>
+    <w:p>
+      <w:pPr>
+        <w:pBdr>
+          <w:bottom w:val="single" w:color="D0D7E0" w:sz="4" w:space="4"/>
+        </w:pBdr>
+        <w:spacing w:after="80" w:before="280"/>
+      </w:pPr>
+      <w:r>
+        <w:rPr>
+          <w:rFonts w:ascii="Arial" w:cs="Arial" w:eastAsia="Arial" w:hAnsi="Arial"/>
+          <w:b/>
+          <w:bCs/>
+          <w:caps/>
+          <w:color w:val="1F4E79"/>
+          <w:sz w:val="20"/>
+          <w:szCs w:val="20"/>
+        </w:rPr>
+        <w:t xml:space="preserve">PART ONE — Demystifying the Magic</w:t>
+      </w:r>
+    </w:p>
+    <w:p>
+      <w:pPr>
+        <w:spacing w:after="60" w:before="180"/>
+        <w:ind w:left="0"/>
+      </w:pPr>
+      <w:r>
+        <w:rPr>
+          <w:rFonts w:ascii="Arial" w:cs="Arial" w:eastAsia="Arial" w:hAnsi="Arial"/>
+          <w:b/>
+          <w:bCs/>
+          <w:color w:val="1A1A2E"/>
+          <w:sz w:val="22"/>
+          <w:szCs w:val="22"/>
+        </w:rPr>
+        <w:t xml:space="preserve">Chapter 1  The Invisible Assistant You're Already Using</w:t>
+      </w:r>
+      <w:r>
+        <w:rPr>
+          <w:rFonts w:ascii="Arial" w:cs="Arial" w:eastAsia="Arial" w:hAnsi="Arial"/>
+          <w:b/>
+          <w:bCs/>
+          <w:color w:val="1A1A2E"/>
+          <w:sz w:val="22"/>
+          <w:szCs w:val="22"/>
+        </w:rPr>
+        <w:ptab w:alignment="right" w:relativeTo="margin" w:leader="dot"/>
+        <w:t xml:space="preserve">5</w:t>
+      </w:r>
+    </w:p>
+    <w:p>
+      <w:pPr>
+        <w:spacing w:after="60" w:before="180"/>
+        <w:ind w:left="0"/>
+      </w:pPr>
+      <w:r>
+        <w:rPr>
+          <w:rFonts w:ascii="Arial" w:cs="Arial" w:eastAsia="Arial" w:hAnsi="Arial"/>
+          <w:b/>
+          <w:bCs/>
+          <w:color w:val="1A1A2E"/>
+          <w:sz w:val="22"/>
+          <w:szCs w:val="22"/>
+        </w:rPr>
+        <w:t xml:space="preserve">Chapter 2  How AI Actually Works (No Math Required)</w:t>
+      </w:r>
+      <w:r>
+        <w:rPr>
+          <w:rFonts w:ascii="Arial" w:cs="Arial" w:eastAsia="Arial" w:hAnsi="Arial"/>
+          <w:b/>
+          <w:bCs/>
+          <w:color w:val="1A1A2E"/>
+          <w:sz w:val="22"/>
+          <w:szCs w:val="22"/>
+        </w:rPr>
+        <w:ptab w:alignment="right" w:relativeTo="margin" w:leader="dot"/>
+        <w:t xml:space="preserve">10</w:t>
+      </w:r>
+    </w:p>
+    <w:p>
+      <w:pPr>
+        <w:spacing w:after="60" w:before="180"/>
+        <w:ind w:left="0"/>
+      </w:pPr>
+      <w:r>
+        <w:rPr>
+          <w:rFonts w:ascii="Arial" w:cs="Arial" w:eastAsia="Arial" w:hAnsi="Arial"/>
+          <w:b/>
+          <w:bCs/>
+          <w:color w:val="1A1A2E"/>
+          <w:sz w:val="22"/>
+          <w:szCs w:val="22"/>
+        </w:rPr>
+        <w:t xml:space="preserve">Chapter 3  The AI Zoo: From ChatGPT to Smart Cameras</w:t>
+      </w:r>
+      <w:r>
+        <w:rPr>
+          <w:rFonts w:ascii="Arial" w:cs="Arial" w:eastAsia="Arial" w:hAnsi="Arial"/>
+          <w:b/>
+          <w:bCs/>
+          <w:color w:val="1A1A2E"/>
+          <w:sz w:val="22"/>
+          <w:szCs w:val="22"/>
+        </w:rPr>
+        <w:ptab w:alignment="right" w:relativeTo="margin" w:leader="dot"/>
+        <w:t xml:space="preserve">15</w:t>
+      </w:r>
+    </w:p>
+    <w:p>
+      <w:pPr>
+        <w:spacing w:after="80" w:before="0"/>
+      </w:pPr>
+      <w:r>
+        <w:t xml:space="preserve"/>
+      </w:r>
+    </w:p>
+    <w:p>
+      <w:pPr>
+        <w:pBdr>
+          <w:bottom w:val="single" w:color="D0D7E0" w:sz="4" w:space="4"/>
+        </w:pBdr>
+        <w:spacing w:after="80" w:before="280"/>
+      </w:pPr>
+      <w:r>
+        <w:rPr>
+          <w:rFonts w:ascii="Arial" w:cs="Arial" w:eastAsia="Arial" w:hAnsi="Arial"/>
+          <w:b/>
+          <w:bCs/>
+          <w:caps/>
+          <w:color w:val="1F4E79"/>
+          <w:sz w:val="20"/>
+          <w:szCs w:val="20"/>
+        </w:rPr>
+        <w:t xml:space="preserve">PART TWO — AI in Your Everyday Life</w:t>
+      </w:r>
+    </w:p>
+    <w:p>
+      <w:pPr>
+        <w:spacing w:after="60" w:before="180"/>
+        <w:ind w:left="0"/>
+      </w:pPr>
+      <w:r>
+        <w:rPr>
+          <w:rFonts w:ascii="Arial" w:cs="Arial" w:eastAsia="Arial" w:hAnsi="Arial"/>
+          <w:b/>
+          <w:bCs/>
+          <w:color w:val="1A1A2E"/>
+          <w:sz w:val="22"/>
+          <w:szCs w:val="22"/>
+        </w:rPr>
+        <w:t xml:space="preserve">Chapter 4  AI at Work: Earning Back Your Time</w:t>
+      </w:r>
+      <w:r>
+        <w:rPr>
+          <w:rFonts w:ascii="Arial" w:cs="Arial" w:eastAsia="Arial" w:hAnsi="Arial"/>
+          <w:b/>
+          <w:bCs/>
+          <w:color w:val="1A1A2E"/>
+          <w:sz w:val="22"/>
+          <w:szCs w:val="22"/>
+        </w:rPr>
+        <w:ptab w:alignment="right" w:relativeTo="margin" w:leader="dot"/>
+        <w:t xml:space="preserve">19</w:t>
+      </w:r>
+    </w:p>
+    <w:p>
+      <w:pPr>
+        <w:spacing w:after="60" w:before="180"/>
+        <w:ind w:left="0"/>
+      </w:pPr>
+      <w:r>
+        <w:rPr>
+          <w:rFonts w:ascii="Arial" w:cs="Arial" w:eastAsia="Arial" w:hAnsi="Arial"/>
+          <w:b/>
+          <w:bCs/>
+          <w:color w:val="1A1A2E"/>
+          <w:sz w:val="22"/>
+          <w:szCs w:val="22"/>
+        </w:rPr>
+        <w:t xml:space="preserve">Chapter 5  AI at Home: The Ultimate Personal Assistant</w:t>
+      </w:r>
+      <w:r>
+        <w:rPr>
+          <w:rFonts w:ascii="Arial" w:cs="Arial" w:eastAsia="Arial" w:hAnsi="Arial"/>
+          <w:b/>
+          <w:bCs/>
+          <w:color w:val="1A1A2E"/>
+          <w:sz w:val="22"/>
+          <w:szCs w:val="22"/>
+        </w:rPr>
+        <w:ptab w:alignment="right" w:relativeTo="margin" w:leader="dot"/>
+        <w:t xml:space="preserve">24</w:t>
+      </w:r>
+    </w:p>
+    <w:p>
+      <w:pPr>
+        <w:spacing w:after="60" w:before="180"/>
+        <w:ind w:left="0"/>
+      </w:pPr>
+      <w:r>
+        <w:rPr>
+          <w:rFonts w:ascii="Arial" w:cs="Arial" w:eastAsia="Arial" w:hAnsi="Arial"/>
+          <w:b/>
+          <w:bCs/>
+          <w:color w:val="1A1A2E"/>
+          <w:sz w:val="22"/>
+          <w:szCs w:val="22"/>
+        </w:rPr>
+        <w:t xml:space="preserve">Chapter 6  Unleashing Your Creativity (Even if You Aren't Creative)</w:t>
+      </w:r>
+      <w:r>
+        <w:rPr>
+          <w:rFonts w:ascii="Arial" w:cs="Arial" w:eastAsia="Arial" w:hAnsi="Arial"/>
+          <w:b/>
+          <w:bCs/>
+          <w:color w:val="1A1A2E"/>
+          <w:sz w:val="22"/>
+          <w:szCs w:val="22"/>
+        </w:rPr>
+        <w:ptab w:alignment="right" w:relativeTo="margin" w:leader="dot"/>
+        <w:t xml:space="preserve">28</w:t>
+      </w:r>
+    </w:p>
+    <w:p>
+      <w:pPr>
+        <w:spacing w:after="60" w:before="180"/>
+        <w:ind w:left="0"/>
+      </w:pPr>
+      <w:r>
+        <w:rPr>
+          <w:rFonts w:ascii="Arial" w:cs="Arial" w:eastAsia="Arial" w:hAnsi="Arial"/>
+          <w:b/>
+          <w:bCs/>
+          <w:color w:val="1A1A2E"/>
+          <w:sz w:val="22"/>
+          <w:szCs w:val="22"/>
+        </w:rPr>
+        <w:t xml:space="preserve">Chapter 7  Health, Learning, and Personal Growth</w:t>
+      </w:r>
+      <w:r>
+        <w:rPr>
+          <w:rFonts w:ascii="Arial" w:cs="Arial" w:eastAsia="Arial" w:hAnsi="Arial"/>
+          <w:b/>
+          <w:bCs/>
+          <w:color w:val="1A1A2E"/>
+          <w:sz w:val="22"/>
+          <w:szCs w:val="22"/>
+        </w:rPr>
+        <w:ptab w:alignment="right" w:relativeTo="margin" w:leader="dot"/>
+        <w:t xml:space="preserve">32</w:t>
+      </w:r>
+    </w:p>
+    <w:p>
+      <w:pPr>
+        <w:spacing w:after="80" w:before="0"/>
+      </w:pPr>
+      <w:r>
+        <w:t xml:space="preserve"/>
+      </w:r>
+    </w:p>
+    <w:p>
+      <w:pPr>
+        <w:pBdr>
+          <w:bottom w:val="single" w:color="D0D7E0" w:sz="4" w:space="4"/>
+        </w:pBdr>
+        <w:spacing w:after="80" w:before="280"/>
+      </w:pPr>
+      <w:r>
+        <w:rPr>
+          <w:rFonts w:ascii="Arial" w:cs="Arial" w:eastAsia="Arial" w:hAnsi="Arial"/>
+          <w:b/>
+          <w:bCs/>
+          <w:caps/>
+          <w:color w:val="1F4E79"/>
+          <w:sz w:val="20"/>
+          <w:szCs w:val="20"/>
+        </w:rPr>
+        <w:t xml:space="preserve">PART THREE — Navigating the Future</w:t>
+      </w:r>
+    </w:p>
+    <w:p>
+      <w:pPr>
+        <w:spacing w:after="60" w:before="180"/>
+        <w:ind w:left="0"/>
+      </w:pPr>
+      <w:r>
+        <w:rPr>
+          <w:rFonts w:ascii="Arial" w:cs="Arial" w:eastAsia="Arial" w:hAnsi="Arial"/>
+          <w:b/>
+          <w:bCs/>
+          <w:color w:val="1A1A2E"/>
+          <w:sz w:val="22"/>
+          <w:szCs w:val="22"/>
+        </w:rPr>
+        <w:t xml:space="preserve">Chapter 8  The Elephant in the Room: Deepfakes, Privacy, and Bias</w:t>
+      </w:r>
+      <w:r>
+        <w:rPr>
+          <w:rFonts w:ascii="Arial" w:cs="Arial" w:eastAsia="Arial" w:hAnsi="Arial"/>
+          <w:b/>
+          <w:bCs/>
+          <w:color w:val="1A1A2E"/>
+          <w:sz w:val="22"/>
+          <w:szCs w:val="22"/>
+        </w:rPr>
+        <w:ptab w:alignment="right" w:relativeTo="margin" w:leader="dot"/>
+        <w:t xml:space="preserve">36</w:t>
+      </w:r>
+    </w:p>
+    <w:p>
+      <w:pPr>
+        <w:spacing w:after="60" w:before="180"/>
+        <w:ind w:left="0"/>
+      </w:pPr>
+      <w:r>
+        <w:rPr>
+          <w:rFonts w:ascii="Arial" w:cs="Arial" w:eastAsia="Arial" w:hAnsi="Arial"/>
+          <w:b/>
+          <w:bCs/>
+          <w:color w:val="1A1A2E"/>
+          <w:sz w:val="22"/>
+          <w:szCs w:val="22"/>
+        </w:rPr>
+        <w:t xml:space="preserve">Chapter 9  What's Next? The Future of Human-AI Collaboration</w:t>
+      </w:r>
+      <w:r>
+        <w:rPr>
+          <w:rFonts w:ascii="Arial" w:cs="Arial" w:eastAsia="Arial" w:hAnsi="Arial"/>
+          <w:b/>
+          <w:bCs/>
+          <w:color w:val="1A1A2E"/>
+          <w:sz w:val="22"/>
+          <w:szCs w:val="22"/>
+        </w:rPr>
+        <w:ptab w:alignment="right" w:relativeTo="margin" w:leader="dot"/>
+        <w:t xml:space="preserve">40</w:t>
+      </w:r>
+    </w:p>
+    <w:p>
+      <w:pPr>
+        <w:spacing w:after="60" w:before="180"/>
+        <w:ind w:left="0"/>
+      </w:pPr>
+      <w:r>
+        <w:rPr>
+          <w:rFonts w:ascii="Arial" w:cs="Arial" w:eastAsia="Arial" w:hAnsi="Arial"/>
+          <w:b/>
+          <w:bCs/>
+          <w:color w:val="1A1A2E"/>
+          <w:sz w:val="22"/>
+          <w:szCs w:val="22"/>
+        </w:rPr>
+        <w:t xml:space="preserve">Chapter 10  Your AI Action Plan: Start Here Today</w:t>
+      </w:r>
+      <w:r>
+        <w:rPr>
+          <w:rFonts w:ascii="Arial" w:cs="Arial" w:eastAsia="Arial" w:hAnsi="Arial"/>
+          <w:b/>
+          <w:bCs/>
+          <w:color w:val="1A1A2E"/>
+          <w:sz w:val="22"/>
+          <w:szCs w:val="22"/>
+        </w:rPr>
+        <w:ptab w:alignment="right" w:relativeTo="margin" w:leader="dot"/>
+        <w:t xml:space="preserve">45</w:t>
+      </w:r>
+    </w:p>
+    <w:p>
+      <w:pPr>
+        <w:spacing w:after="80" w:before="0"/>
+      </w:pPr>
+      <w:r>
+        <w:t xml:space="preserve"/>
+      </w:r>
+    </w:p>
+    <w:p>
+      <w:pPr>
+        <w:pBdr>
+          <w:bottom w:val="single" w:color="D0D7E0" w:sz="4" w:space="4"/>
+        </w:pBdr>
+        <w:spacing w:after="80" w:before="280"/>
+      </w:pPr>
+      <w:r>
+        <w:rPr>
+          <w:rFonts w:ascii="Arial" w:cs="Arial" w:eastAsia="Arial" w:hAnsi="Arial"/>
+          <w:b/>
+          <w:bCs/>
+          <w:caps/>
+          <w:color w:val="1F4E79"/>
+          <w:sz w:val="20"/>
+          <w:szCs w:val="20"/>
+        </w:rPr>
+        <w:t xml:space="preserve">APPENDIX</w:t>
+      </w:r>
+    </w:p>
+    <w:p>
+      <w:pPr>
+        <w:spacing w:after="40" w:before="80"/>
+        <w:ind w:left="360"/>
+      </w:pPr>
+      <w:r>
+        <w:rPr>
+          <w:rFonts w:ascii="Georgia" w:cs="Georgia" w:eastAsia="Georgia" w:hAnsi="Georgia"/>
+          <w:b w:val="false"/>
+          <w:bCs w:val="false"/>
+          <w:color w:val="444444"/>
+          <w:sz w:val="20"/>
+          <w:szCs w:val="20"/>
+        </w:rPr>
+        <w:t xml:space="preserve">  Quick Reference Prompt Guide</w:t>
+      </w:r>
+      <w:r>
+        <w:rPr>
+          <w:rFonts w:ascii="Arial" w:cs="Arial" w:eastAsia="Arial" w:hAnsi="Arial"/>
+          <w:b w:val="false"/>
+          <w:bCs w:val="false"/>
+          <w:color w:val="444444"/>
+          <w:sz w:val="20"/>
+          <w:szCs w:val="20"/>
+        </w:rPr>
+        <w:ptab w:alignment="right" w:relativeTo="margin" w:leader="dot"/>
+        <w:t xml:space="preserve">50</w:t>
       </w:r>
     </w:p>
     <w:p>

</xml_diff>

<commit_message>
Reformat Table of Contents - table layout with right-aligned page numbers
</commit_message>
<xml_diff>
--- a/AI_for_Everyone_by_Alok_Maurya.docx
+++ b/AI_for_Everyone_by_Alok_Maurya.docx
@@ -113,7 +113,7 @@
     <w:p>
       <w:pPr>
         <w:spacing w:after="60" w:before="480"/>
-        <w:jc w:val="center"/>
+        <w:jc w:val="left"/>
       </w:pPr>
       <w:r>
         <w:rPr>
@@ -122,487 +122,1072 @@
           <w:bCs/>
           <w:caps/>
           <w:color w:val="1A1A2E"/>
-          <w:sz w:val="36"/>
-          <w:szCs w:val="36"/>
+          <w:sz w:val="40"/>
+          <w:szCs w:val="40"/>
         </w:rPr>
         <w:t xml:space="preserve">TABLE OF CONTENTS</w:t>
       </w:r>
     </w:p>
     <w:p>
       <w:pPr>
-        <w:spacing w:after="480" w:before="0"/>
-        <w:jc w:val="center"/>
-      </w:pPr>
-      <w:r>
-        <w:rPr>
-          <w:rFonts w:ascii="Arial" w:cs="Arial" w:eastAsia="Arial" w:hAnsi="Arial"/>
-          <w:color w:val="C0C8D4"/>
-          <w:sz w:val="20"/>
-          <w:szCs w:val="20"/>
-        </w:rPr>
-        <w:t xml:space="preserve">─────────────────────────────────────────────────</w:t>
-      </w:r>
-    </w:p>
-    <w:p>
-      <w:pPr>
-        <w:spacing w:after="40" w:before="80"/>
-        <w:ind w:left="360"/>
-      </w:pPr>
-      <w:r>
-        <w:rPr>
-          <w:rFonts w:ascii="Georgia" w:cs="Georgia" w:eastAsia="Georgia" w:hAnsi="Georgia"/>
-          <w:b w:val="false"/>
-          <w:bCs w:val="false"/>
-          <w:color w:val="444444"/>
-          <w:sz w:val="20"/>
-          <w:szCs w:val="20"/>
-        </w:rPr>
-        <w:t xml:space="preserve">  Introduction</w:t>
-      </w:r>
-      <w:r>
-        <w:rPr>
-          <w:rFonts w:ascii="Arial" w:cs="Arial" w:eastAsia="Arial" w:hAnsi="Arial"/>
-          <w:b w:val="false"/>
-          <w:bCs w:val="false"/>
-          <w:color w:val="444444"/>
-          <w:sz w:val="20"/>
-          <w:szCs w:val="20"/>
-        </w:rPr>
-        <w:ptab w:alignment="right" w:relativeTo="margin" w:leader="dot"/>
-        <w:t xml:space="preserve">2</w:t>
-      </w:r>
-    </w:p>
-    <w:p>
-      <w:pPr>
-        <w:spacing w:after="120" w:before="0"/>
+        <w:pBdr>
+          <w:bottom w:val="single" w:color="1F4E79" w:sz="8" w:space="8"/>
+        </w:pBdr>
+        <w:spacing w:after="360" w:before="0"/>
       </w:pPr>
       <w:r>
         <w:t xml:space="preserve"/>
       </w:r>
     </w:p>
-    <w:p>
-      <w:pPr>
-        <w:pBdr>
-          <w:bottom w:val="single" w:color="D0D7E0" w:sz="4" w:space="4"/>
-        </w:pBdr>
-        <w:spacing w:after="80" w:before="280"/>
-      </w:pPr>
-      <w:r>
-        <w:rPr>
-          <w:rFonts w:ascii="Arial" w:cs="Arial" w:eastAsia="Arial" w:hAnsi="Arial"/>
-          <w:b/>
-          <w:bCs/>
-          <w:caps/>
-          <w:color w:val="1F4E79"/>
-          <w:sz w:val="20"/>
-          <w:szCs w:val="20"/>
-        </w:rPr>
-        <w:t xml:space="preserve">PART ONE — Demystifying the Magic</w:t>
-      </w:r>
-    </w:p>
-    <w:p>
-      <w:pPr>
-        <w:spacing w:after="60" w:before="180"/>
-        <w:ind w:left="0"/>
-      </w:pPr>
-      <w:r>
-        <w:rPr>
-          <w:rFonts w:ascii="Arial" w:cs="Arial" w:eastAsia="Arial" w:hAnsi="Arial"/>
-          <w:b/>
-          <w:bCs/>
-          <w:color w:val="1A1A2E"/>
-          <w:sz w:val="22"/>
-          <w:szCs w:val="22"/>
-        </w:rPr>
-        <w:t xml:space="preserve">Chapter 1  The Invisible Assistant You're Already Using</w:t>
-      </w:r>
-      <w:r>
-        <w:rPr>
-          <w:rFonts w:ascii="Arial" w:cs="Arial" w:eastAsia="Arial" w:hAnsi="Arial"/>
-          <w:b/>
-          <w:bCs/>
-          <w:color w:val="1A1A2E"/>
-          <w:sz w:val="22"/>
-          <w:szCs w:val="22"/>
-        </w:rPr>
-        <w:ptab w:alignment="right" w:relativeTo="margin" w:leader="dot"/>
-        <w:t xml:space="preserve">5</w:t>
-      </w:r>
-    </w:p>
-    <w:p>
-      <w:pPr>
-        <w:spacing w:after="60" w:before="180"/>
-        <w:ind w:left="0"/>
-      </w:pPr>
-      <w:r>
-        <w:rPr>
-          <w:rFonts w:ascii="Arial" w:cs="Arial" w:eastAsia="Arial" w:hAnsi="Arial"/>
-          <w:b/>
-          <w:bCs/>
-          <w:color w:val="1A1A2E"/>
-          <w:sz w:val="22"/>
-          <w:szCs w:val="22"/>
-        </w:rPr>
-        <w:t xml:space="preserve">Chapter 2  How AI Actually Works (No Math Required)</w:t>
-      </w:r>
-      <w:r>
-        <w:rPr>
-          <w:rFonts w:ascii="Arial" w:cs="Arial" w:eastAsia="Arial" w:hAnsi="Arial"/>
-          <w:b/>
-          <w:bCs/>
-          <w:color w:val="1A1A2E"/>
-          <w:sz w:val="22"/>
-          <w:szCs w:val="22"/>
-        </w:rPr>
-        <w:ptab w:alignment="right" w:relativeTo="margin" w:leader="dot"/>
-        <w:t xml:space="preserve">10</w:t>
-      </w:r>
-    </w:p>
-    <w:p>
-      <w:pPr>
-        <w:spacing w:after="60" w:before="180"/>
-        <w:ind w:left="0"/>
-      </w:pPr>
-      <w:r>
-        <w:rPr>
-          <w:rFonts w:ascii="Arial" w:cs="Arial" w:eastAsia="Arial" w:hAnsi="Arial"/>
-          <w:b/>
-          <w:bCs/>
-          <w:color w:val="1A1A2E"/>
-          <w:sz w:val="22"/>
-          <w:szCs w:val="22"/>
-        </w:rPr>
-        <w:t xml:space="preserve">Chapter 3  The AI Zoo: From ChatGPT to Smart Cameras</w:t>
-      </w:r>
-      <w:r>
-        <w:rPr>
-          <w:rFonts w:ascii="Arial" w:cs="Arial" w:eastAsia="Arial" w:hAnsi="Arial"/>
-          <w:b/>
-          <w:bCs/>
-          <w:color w:val="1A1A2E"/>
-          <w:sz w:val="22"/>
-          <w:szCs w:val="22"/>
-        </w:rPr>
-        <w:ptab w:alignment="right" w:relativeTo="margin" w:leader="dot"/>
-        <w:t xml:space="preserve">15</w:t>
-      </w:r>
-    </w:p>
-    <w:p>
-      <w:pPr>
-        <w:spacing w:after="80" w:before="0"/>
-      </w:pPr>
-      <w:r>
-        <w:t xml:space="preserve"/>
-      </w:r>
-    </w:p>
-    <w:p>
-      <w:pPr>
-        <w:pBdr>
-          <w:bottom w:val="single" w:color="D0D7E0" w:sz="4" w:space="4"/>
-        </w:pBdr>
-        <w:spacing w:after="80" w:before="280"/>
-      </w:pPr>
-      <w:r>
-        <w:rPr>
-          <w:rFonts w:ascii="Arial" w:cs="Arial" w:eastAsia="Arial" w:hAnsi="Arial"/>
-          <w:b/>
-          <w:bCs/>
-          <w:caps/>
-          <w:color w:val="1F4E79"/>
-          <w:sz w:val="20"/>
-          <w:szCs w:val="20"/>
-        </w:rPr>
-        <w:t xml:space="preserve">PART TWO — AI in Your Everyday Life</w:t>
-      </w:r>
-    </w:p>
-    <w:p>
-      <w:pPr>
-        <w:spacing w:after="60" w:before="180"/>
-        <w:ind w:left="0"/>
-      </w:pPr>
-      <w:r>
-        <w:rPr>
-          <w:rFonts w:ascii="Arial" w:cs="Arial" w:eastAsia="Arial" w:hAnsi="Arial"/>
-          <w:b/>
-          <w:bCs/>
-          <w:color w:val="1A1A2E"/>
-          <w:sz w:val="22"/>
-          <w:szCs w:val="22"/>
-        </w:rPr>
-        <w:t xml:space="preserve">Chapter 4  AI at Work: Earning Back Your Time</w:t>
-      </w:r>
-      <w:r>
-        <w:rPr>
-          <w:rFonts w:ascii="Arial" w:cs="Arial" w:eastAsia="Arial" w:hAnsi="Arial"/>
-          <w:b/>
-          <w:bCs/>
-          <w:color w:val="1A1A2E"/>
-          <w:sz w:val="22"/>
-          <w:szCs w:val="22"/>
-        </w:rPr>
-        <w:ptab w:alignment="right" w:relativeTo="margin" w:leader="dot"/>
-        <w:t xml:space="preserve">19</w:t>
-      </w:r>
-    </w:p>
-    <w:p>
-      <w:pPr>
-        <w:spacing w:after="60" w:before="180"/>
-        <w:ind w:left="0"/>
-      </w:pPr>
-      <w:r>
-        <w:rPr>
-          <w:rFonts w:ascii="Arial" w:cs="Arial" w:eastAsia="Arial" w:hAnsi="Arial"/>
-          <w:b/>
-          <w:bCs/>
-          <w:color w:val="1A1A2E"/>
-          <w:sz w:val="22"/>
-          <w:szCs w:val="22"/>
-        </w:rPr>
-        <w:t xml:space="preserve">Chapter 5  AI at Home: The Ultimate Personal Assistant</w:t>
-      </w:r>
-      <w:r>
-        <w:rPr>
-          <w:rFonts w:ascii="Arial" w:cs="Arial" w:eastAsia="Arial" w:hAnsi="Arial"/>
-          <w:b/>
-          <w:bCs/>
-          <w:color w:val="1A1A2E"/>
-          <w:sz w:val="22"/>
-          <w:szCs w:val="22"/>
-        </w:rPr>
-        <w:ptab w:alignment="right" w:relativeTo="margin" w:leader="dot"/>
-        <w:t xml:space="preserve">24</w:t>
-      </w:r>
-    </w:p>
-    <w:p>
-      <w:pPr>
-        <w:spacing w:after="60" w:before="180"/>
-        <w:ind w:left="0"/>
-      </w:pPr>
-      <w:r>
-        <w:rPr>
-          <w:rFonts w:ascii="Arial" w:cs="Arial" w:eastAsia="Arial" w:hAnsi="Arial"/>
-          <w:b/>
-          <w:bCs/>
-          <w:color w:val="1A1A2E"/>
-          <w:sz w:val="22"/>
-          <w:szCs w:val="22"/>
-        </w:rPr>
-        <w:t xml:space="preserve">Chapter 6  Unleashing Your Creativity (Even if You Aren't Creative)</w:t>
-      </w:r>
-      <w:r>
-        <w:rPr>
-          <w:rFonts w:ascii="Arial" w:cs="Arial" w:eastAsia="Arial" w:hAnsi="Arial"/>
-          <w:b/>
-          <w:bCs/>
-          <w:color w:val="1A1A2E"/>
-          <w:sz w:val="22"/>
-          <w:szCs w:val="22"/>
-        </w:rPr>
-        <w:ptab w:alignment="right" w:relativeTo="margin" w:leader="dot"/>
-        <w:t xml:space="preserve">28</w:t>
-      </w:r>
-    </w:p>
-    <w:p>
-      <w:pPr>
-        <w:spacing w:after="60" w:before="180"/>
-        <w:ind w:left="0"/>
-      </w:pPr>
-      <w:r>
-        <w:rPr>
-          <w:rFonts w:ascii="Arial" w:cs="Arial" w:eastAsia="Arial" w:hAnsi="Arial"/>
-          <w:b/>
-          <w:bCs/>
-          <w:color w:val="1A1A2E"/>
-          <w:sz w:val="22"/>
-          <w:szCs w:val="22"/>
-        </w:rPr>
-        <w:t xml:space="preserve">Chapter 7  Health, Learning, and Personal Growth</w:t>
-      </w:r>
-      <w:r>
-        <w:rPr>
-          <w:rFonts w:ascii="Arial" w:cs="Arial" w:eastAsia="Arial" w:hAnsi="Arial"/>
-          <w:b/>
-          <w:bCs/>
-          <w:color w:val="1A1A2E"/>
-          <w:sz w:val="22"/>
-          <w:szCs w:val="22"/>
-        </w:rPr>
-        <w:ptab w:alignment="right" w:relativeTo="margin" w:leader="dot"/>
-        <w:t xml:space="preserve">32</w:t>
-      </w:r>
-    </w:p>
-    <w:p>
-      <w:pPr>
-        <w:spacing w:after="80" w:before="0"/>
-      </w:pPr>
-      <w:r>
-        <w:t xml:space="preserve"/>
-      </w:r>
-    </w:p>
-    <w:p>
-      <w:pPr>
-        <w:pBdr>
-          <w:bottom w:val="single" w:color="D0D7E0" w:sz="4" w:space="4"/>
-        </w:pBdr>
-        <w:spacing w:after="80" w:before="280"/>
-      </w:pPr>
-      <w:r>
-        <w:rPr>
-          <w:rFonts w:ascii="Arial" w:cs="Arial" w:eastAsia="Arial" w:hAnsi="Arial"/>
-          <w:b/>
-          <w:bCs/>
-          <w:caps/>
-          <w:color w:val="1F4E79"/>
-          <w:sz w:val="20"/>
-          <w:szCs w:val="20"/>
-        </w:rPr>
-        <w:t xml:space="preserve">PART THREE — Navigating the Future</w:t>
-      </w:r>
-    </w:p>
-    <w:p>
-      <w:pPr>
-        <w:spacing w:after="60" w:before="180"/>
-        <w:ind w:left="0"/>
-      </w:pPr>
-      <w:r>
-        <w:rPr>
-          <w:rFonts w:ascii="Arial" w:cs="Arial" w:eastAsia="Arial" w:hAnsi="Arial"/>
-          <w:b/>
-          <w:bCs/>
-          <w:color w:val="1A1A2E"/>
-          <w:sz w:val="22"/>
-          <w:szCs w:val="22"/>
-        </w:rPr>
-        <w:t xml:space="preserve">Chapter 8  The Elephant in the Room: Deepfakes, Privacy, and Bias</w:t>
-      </w:r>
-      <w:r>
-        <w:rPr>
-          <w:rFonts w:ascii="Arial" w:cs="Arial" w:eastAsia="Arial" w:hAnsi="Arial"/>
-          <w:b/>
-          <w:bCs/>
-          <w:color w:val="1A1A2E"/>
-          <w:sz w:val="22"/>
-          <w:szCs w:val="22"/>
-        </w:rPr>
-        <w:ptab w:alignment="right" w:relativeTo="margin" w:leader="dot"/>
-        <w:t xml:space="preserve">36</w:t>
-      </w:r>
-    </w:p>
-    <w:p>
-      <w:pPr>
-        <w:spacing w:after="60" w:before="180"/>
-        <w:ind w:left="0"/>
-      </w:pPr>
-      <w:r>
-        <w:rPr>
-          <w:rFonts w:ascii="Arial" w:cs="Arial" w:eastAsia="Arial" w:hAnsi="Arial"/>
-          <w:b/>
-          <w:bCs/>
-          <w:color w:val="1A1A2E"/>
-          <w:sz w:val="22"/>
-          <w:szCs w:val="22"/>
-        </w:rPr>
-        <w:t xml:space="preserve">Chapter 9  What's Next? The Future of Human-AI Collaboration</w:t>
-      </w:r>
-      <w:r>
-        <w:rPr>
-          <w:rFonts w:ascii="Arial" w:cs="Arial" w:eastAsia="Arial" w:hAnsi="Arial"/>
-          <w:b/>
-          <w:bCs/>
-          <w:color w:val="1A1A2E"/>
-          <w:sz w:val="22"/>
-          <w:szCs w:val="22"/>
-        </w:rPr>
-        <w:ptab w:alignment="right" w:relativeTo="margin" w:leader="dot"/>
-        <w:t xml:space="preserve">40</w:t>
-      </w:r>
-    </w:p>
-    <w:p>
-      <w:pPr>
-        <w:spacing w:after="60" w:before="180"/>
-        <w:ind w:left="0"/>
-      </w:pPr>
-      <w:r>
-        <w:rPr>
-          <w:rFonts w:ascii="Arial" w:cs="Arial" w:eastAsia="Arial" w:hAnsi="Arial"/>
-          <w:b/>
-          <w:bCs/>
-          <w:color w:val="1A1A2E"/>
-          <w:sz w:val="22"/>
-          <w:szCs w:val="22"/>
-        </w:rPr>
-        <w:t xml:space="preserve">Chapter 10  Your AI Action Plan: Start Here Today</w:t>
-      </w:r>
-      <w:r>
-        <w:rPr>
-          <w:rFonts w:ascii="Arial" w:cs="Arial" w:eastAsia="Arial" w:hAnsi="Arial"/>
-          <w:b/>
-          <w:bCs/>
-          <w:color w:val="1A1A2E"/>
-          <w:sz w:val="22"/>
-          <w:szCs w:val="22"/>
-        </w:rPr>
-        <w:ptab w:alignment="right" w:relativeTo="margin" w:leader="dot"/>
-        <w:t xml:space="preserve">45</w:t>
-      </w:r>
-    </w:p>
-    <w:p>
-      <w:pPr>
-        <w:spacing w:after="80" w:before="0"/>
-      </w:pPr>
-      <w:r>
-        <w:t xml:space="preserve"/>
-      </w:r>
-    </w:p>
-    <w:p>
-      <w:pPr>
-        <w:pBdr>
-          <w:bottom w:val="single" w:color="D0D7E0" w:sz="4" w:space="4"/>
-        </w:pBdr>
-        <w:spacing w:after="80" w:before="280"/>
-      </w:pPr>
-      <w:r>
-        <w:rPr>
-          <w:rFonts w:ascii="Arial" w:cs="Arial" w:eastAsia="Arial" w:hAnsi="Arial"/>
-          <w:b/>
-          <w:bCs/>
-          <w:caps/>
-          <w:color w:val="1F4E79"/>
-          <w:sz w:val="20"/>
-          <w:szCs w:val="20"/>
-        </w:rPr>
-        <w:t xml:space="preserve">APPENDIX</w:t>
-      </w:r>
-    </w:p>
-    <w:p>
-      <w:pPr>
-        <w:spacing w:after="40" w:before="80"/>
-        <w:ind w:left="360"/>
-      </w:pPr>
-      <w:r>
-        <w:rPr>
-          <w:rFonts w:ascii="Georgia" w:cs="Georgia" w:eastAsia="Georgia" w:hAnsi="Georgia"/>
-          <w:b w:val="false"/>
-          <w:bCs w:val="false"/>
-          <w:color w:val="444444"/>
-          <w:sz w:val="20"/>
-          <w:szCs w:val="20"/>
-        </w:rPr>
-        <w:t xml:space="preserve">  Quick Reference Prompt Guide</w:t>
-      </w:r>
-      <w:r>
-        <w:rPr>
-          <w:rFonts w:ascii="Arial" w:cs="Arial" w:eastAsia="Arial" w:hAnsi="Arial"/>
-          <w:b w:val="false"/>
-          <w:bCs w:val="false"/>
-          <w:color w:val="444444"/>
-          <w:sz w:val="20"/>
-          <w:szCs w:val="20"/>
-        </w:rPr>
-        <w:ptab w:alignment="right" w:relativeTo="margin" w:leader="dot"/>
-        <w:t xml:space="preserve">50</w:t>
-      </w:r>
-    </w:p>
+    <w:tbl>
+      <w:tblPr>
+        <w:tblW w:type="dxa" w:w="9360"/>
+        <w:tblBorders>
+          <w:top w:val="single" w:color="auto" w:sz="4"/>
+          <w:left w:val="single" w:color="auto" w:sz="4"/>
+          <w:bottom w:val="single" w:color="auto" w:sz="4"/>
+          <w:right w:val="single" w:color="auto" w:sz="4"/>
+          <w:insideH w:val="single" w:color="auto" w:sz="4"/>
+          <w:insideV w:val="single" w:color="auto" w:sz="4"/>
+        </w:tblBorders>
+      </w:tblPr>
+      <w:tblGrid>
+        <w:gridCol w:w="8200"/>
+        <w:gridCol w:w="1160"/>
+      </w:tblGrid>
+      <w:tr>
+        <w:tc>
+          <w:tcPr>
+            <w:tcW w:type="dxa" w:w="8200"/>
+            <w:tcBorders>
+              <w:top w:val="none" w:color="FFFFFF" w:sz="0"/>
+              <w:left w:val="none" w:color="FFFFFF" w:sz="0"/>
+              <w:bottom w:val="none" w:color="FFFFFF" w:sz="0"/>
+              <w:right w:val="none" w:color="FFFFFF" w:sz="0"/>
+            </w:tcBorders>
+            <w:tcMar>
+              <w:top w:type="dxa" w:w="60"/>
+              <w:left w:type="dxa" w:w="360"/>
+              <w:bottom w:type="dxa" w:w="60"/>
+              <w:right w:type="dxa" w:w="120"/>
+            </w:tcMar>
+          </w:tcPr>
+          <w:p>
+            <w:r>
+              <w:rPr>
+                <w:rFonts w:ascii="Georgia" w:cs="Georgia" w:eastAsia="Georgia" w:hAnsi="Georgia"/>
+                <w:b w:val="false"/>
+                <w:bCs w:val="false"/>
+                <w:color w:val="555555"/>
+                <w:sz w:val="20"/>
+                <w:szCs w:val="20"/>
+              </w:rPr>
+              <w:t xml:space="preserve">Introduction</w:t>
+            </w:r>
+          </w:p>
+        </w:tc>
+        <w:tc>
+          <w:tcPr>
+            <w:tcW w:type="dxa" w:w="1160"/>
+            <w:tcBorders>
+              <w:top w:val="none" w:color="FFFFFF" w:sz="0"/>
+              <w:left w:val="none" w:color="FFFFFF" w:sz="0"/>
+              <w:bottom w:val="none" w:color="FFFFFF" w:sz="0"/>
+              <w:right w:val="none" w:color="FFFFFF" w:sz="0"/>
+            </w:tcBorders>
+            <w:tcMar>
+              <w:top w:type="dxa" w:w="60"/>
+              <w:left w:type="dxa" w:w="0"/>
+              <w:bottom w:type="dxa" w:w="60"/>
+              <w:right w:type="dxa" w:w="0"/>
+            </w:tcMar>
+          </w:tcPr>
+          <w:p>
+            <w:pPr>
+              <w:jc w:val="right"/>
+            </w:pPr>
+            <w:r>
+              <w:rPr>
+                <w:rFonts w:ascii="Arial" w:cs="Arial" w:eastAsia="Arial" w:hAnsi="Arial"/>
+                <w:b w:val="false"/>
+                <w:bCs w:val="false"/>
+                <w:color w:val="777777"/>
+                <w:sz w:val="20"/>
+                <w:szCs w:val="20"/>
+              </w:rPr>
+              <w:t xml:space="preserve">2</w:t>
+            </w:r>
+          </w:p>
+        </w:tc>
+      </w:tr>
+      <w:tr>
+        <w:tc>
+          <w:tcPr>
+            <w:tcW w:type="dxa" w:w="9360"/>
+            <w:gridSpan w:val="2"/>
+            <w:tcBorders>
+              <w:top w:val="none" w:color="FFFFFF" w:sz="0"/>
+              <w:left w:val="none" w:color="FFFFFF" w:sz="0"/>
+              <w:bottom w:val="none" w:color="FFFFFF" w:sz="0"/>
+              <w:right w:val="none" w:color="FFFFFF" w:sz="0"/>
+            </w:tcBorders>
+            <w:tcMar>
+              <w:top w:type="dxa" w:w="0"/>
+              <w:left w:type="dxa" w:w="0"/>
+              <w:bottom w:type="dxa" w:w="0"/>
+              <w:right w:type="dxa" w:w="0"/>
+            </w:tcMar>
+          </w:tcPr>
+          <w:p>
+            <w:pPr>
+              <w:spacing w:after="0" w:before="0"/>
+            </w:pPr>
+            <w:r>
+              <w:t xml:space="preserve"/>
+            </w:r>
+          </w:p>
+        </w:tc>
+      </w:tr>
+      <w:tr>
+        <w:tc>
+          <w:tcPr>
+            <w:tcW w:type="dxa" w:w="9360"/>
+            <w:gridSpan w:val="2"/>
+            <w:tcBorders>
+              <w:top w:val="none" w:color="FFFFFF" w:sz="0"/>
+              <w:left w:val="none" w:color="FFFFFF" w:sz="0"/>
+              <w:bottom w:val="none" w:color="FFFFFF" w:sz="0"/>
+              <w:right w:val="none" w:color="FFFFFF" w:sz="0"/>
+            </w:tcBorders>
+            <w:shd w:fill="1F4E79" w:val="clear"/>
+            <w:tcMar>
+              <w:top w:type="dxa" w:w="120"/>
+              <w:left w:type="dxa" w:w="120"/>
+              <w:bottom w:type="dxa" w:w="120"/>
+              <w:right w:type="dxa" w:w="120"/>
+            </w:tcMar>
+          </w:tcPr>
+          <w:p>
+            <w:r>
+              <w:rPr>
+                <w:rFonts w:ascii="Arial" w:cs="Arial" w:eastAsia="Arial" w:hAnsi="Arial"/>
+                <w:b/>
+                <w:bCs/>
+                <w:caps/>
+                <w:color w:val="FFFFFF"/>
+                <w:sz w:val="19"/>
+                <w:szCs w:val="19"/>
+              </w:rPr>
+              <w:t xml:space="preserve">Part One  —  Demystifying the Magic: Understanding AI</w:t>
+            </w:r>
+          </w:p>
+        </w:tc>
+      </w:tr>
+      <w:tr>
+        <w:tc>
+          <w:tcPr>
+            <w:tcW w:type="dxa" w:w="8200"/>
+            <w:tcBorders>
+              <w:top w:val="none" w:color="FFFFFF" w:sz="0"/>
+              <w:left w:val="none" w:color="FFFFFF" w:sz="0"/>
+              <w:bottom w:val="none" w:color="FFFFFF" w:sz="0"/>
+              <w:right w:val="none" w:color="FFFFFF" w:sz="0"/>
+            </w:tcBorders>
+            <w:tcMar>
+              <w:top w:type="dxa" w:w="100"/>
+              <w:left w:type="dxa" w:w="0"/>
+              <w:bottom w:type="dxa" w:w="100"/>
+              <w:right w:type="dxa" w:w="120"/>
+            </w:tcMar>
+          </w:tcPr>
+          <w:p>
+            <w:r>
+              <w:rPr>
+                <w:rFonts w:ascii="Arial" w:cs="Arial" w:eastAsia="Arial" w:hAnsi="Arial"/>
+                <w:b/>
+                <w:bCs/>
+                <w:color w:val="1A1A2E"/>
+                <w:sz w:val="22"/>
+                <w:szCs w:val="22"/>
+              </w:rPr>
+              <w:t xml:space="preserve">Chapter 1   The Invisible Assistant You're Already Using</w:t>
+            </w:r>
+          </w:p>
+        </w:tc>
+        <w:tc>
+          <w:tcPr>
+            <w:tcW w:type="dxa" w:w="1160"/>
+            <w:tcBorders>
+              <w:top w:val="none" w:color="FFFFFF" w:sz="0"/>
+              <w:left w:val="none" w:color="FFFFFF" w:sz="0"/>
+              <w:bottom w:val="none" w:color="FFFFFF" w:sz="0"/>
+              <w:right w:val="none" w:color="FFFFFF" w:sz="0"/>
+            </w:tcBorders>
+            <w:tcMar>
+              <w:top w:type="dxa" w:w="100"/>
+              <w:left w:type="dxa" w:w="0"/>
+              <w:bottom w:type="dxa" w:w="100"/>
+              <w:right w:type="dxa" w:w="0"/>
+            </w:tcMar>
+          </w:tcPr>
+          <w:p>
+            <w:pPr>
+              <w:jc w:val="right"/>
+            </w:pPr>
+            <w:r>
+              <w:rPr>
+                <w:rFonts w:ascii="Arial" w:cs="Arial" w:eastAsia="Arial" w:hAnsi="Arial"/>
+                <w:b/>
+                <w:bCs/>
+                <w:color w:val="1F4E79"/>
+                <w:sz w:val="22"/>
+                <w:szCs w:val="22"/>
+              </w:rPr>
+              <w:t xml:space="preserve">5</w:t>
+            </w:r>
+          </w:p>
+        </w:tc>
+      </w:tr>
+      <w:tr>
+        <w:tc>
+          <w:tcPr>
+            <w:tcW w:type="dxa" w:w="8200"/>
+            <w:tcBorders>
+              <w:top w:val="none" w:color="FFFFFF" w:sz="0"/>
+              <w:left w:val="none" w:color="FFFFFF" w:sz="0"/>
+              <w:bottom w:val="none" w:color="FFFFFF" w:sz="0"/>
+              <w:right w:val="none" w:color="FFFFFF" w:sz="0"/>
+            </w:tcBorders>
+            <w:tcMar>
+              <w:top w:type="dxa" w:w="100"/>
+              <w:left w:type="dxa" w:w="0"/>
+              <w:bottom w:type="dxa" w:w="100"/>
+              <w:right w:type="dxa" w:w="120"/>
+            </w:tcMar>
+          </w:tcPr>
+          <w:p>
+            <w:r>
+              <w:rPr>
+                <w:rFonts w:ascii="Arial" w:cs="Arial" w:eastAsia="Arial" w:hAnsi="Arial"/>
+                <w:b/>
+                <w:bCs/>
+                <w:color w:val="1A1A2E"/>
+                <w:sz w:val="22"/>
+                <w:szCs w:val="22"/>
+              </w:rPr>
+              <w:t xml:space="preserve">Chapter 2   How AI Actually Works (No Math Required)</w:t>
+            </w:r>
+          </w:p>
+        </w:tc>
+        <w:tc>
+          <w:tcPr>
+            <w:tcW w:type="dxa" w:w="1160"/>
+            <w:tcBorders>
+              <w:top w:val="none" w:color="FFFFFF" w:sz="0"/>
+              <w:left w:val="none" w:color="FFFFFF" w:sz="0"/>
+              <w:bottom w:val="none" w:color="FFFFFF" w:sz="0"/>
+              <w:right w:val="none" w:color="FFFFFF" w:sz="0"/>
+            </w:tcBorders>
+            <w:tcMar>
+              <w:top w:type="dxa" w:w="100"/>
+              <w:left w:type="dxa" w:w="0"/>
+              <w:bottom w:type="dxa" w:w="100"/>
+              <w:right w:type="dxa" w:w="0"/>
+            </w:tcMar>
+          </w:tcPr>
+          <w:p>
+            <w:pPr>
+              <w:jc w:val="right"/>
+            </w:pPr>
+            <w:r>
+              <w:rPr>
+                <w:rFonts w:ascii="Arial" w:cs="Arial" w:eastAsia="Arial" w:hAnsi="Arial"/>
+                <w:b/>
+                <w:bCs/>
+                <w:color w:val="1F4E79"/>
+                <w:sz w:val="22"/>
+                <w:szCs w:val="22"/>
+              </w:rPr>
+              <w:t xml:space="preserve">10</w:t>
+            </w:r>
+          </w:p>
+        </w:tc>
+      </w:tr>
+      <w:tr>
+        <w:tc>
+          <w:tcPr>
+            <w:tcW w:type="dxa" w:w="8200"/>
+            <w:tcBorders>
+              <w:top w:val="none" w:color="FFFFFF" w:sz="0"/>
+              <w:left w:val="none" w:color="FFFFFF" w:sz="0"/>
+              <w:bottom w:val="none" w:color="FFFFFF" w:sz="0"/>
+              <w:right w:val="none" w:color="FFFFFF" w:sz="0"/>
+            </w:tcBorders>
+            <w:tcMar>
+              <w:top w:type="dxa" w:w="100"/>
+              <w:left w:type="dxa" w:w="0"/>
+              <w:bottom w:type="dxa" w:w="100"/>
+              <w:right w:type="dxa" w:w="120"/>
+            </w:tcMar>
+          </w:tcPr>
+          <w:p>
+            <w:r>
+              <w:rPr>
+                <w:rFonts w:ascii="Arial" w:cs="Arial" w:eastAsia="Arial" w:hAnsi="Arial"/>
+                <w:b/>
+                <w:bCs/>
+                <w:color w:val="1A1A2E"/>
+                <w:sz w:val="22"/>
+                <w:szCs w:val="22"/>
+              </w:rPr>
+              <w:t xml:space="preserve">Chapter 3   The AI Zoo: From ChatGPT to Smart Cameras</w:t>
+            </w:r>
+          </w:p>
+        </w:tc>
+        <w:tc>
+          <w:tcPr>
+            <w:tcW w:type="dxa" w:w="1160"/>
+            <w:tcBorders>
+              <w:top w:val="none" w:color="FFFFFF" w:sz="0"/>
+              <w:left w:val="none" w:color="FFFFFF" w:sz="0"/>
+              <w:bottom w:val="none" w:color="FFFFFF" w:sz="0"/>
+              <w:right w:val="none" w:color="FFFFFF" w:sz="0"/>
+            </w:tcBorders>
+            <w:tcMar>
+              <w:top w:type="dxa" w:w="100"/>
+              <w:left w:type="dxa" w:w="0"/>
+              <w:bottom w:type="dxa" w:w="100"/>
+              <w:right w:type="dxa" w:w="0"/>
+            </w:tcMar>
+          </w:tcPr>
+          <w:p>
+            <w:pPr>
+              <w:jc w:val="right"/>
+            </w:pPr>
+            <w:r>
+              <w:rPr>
+                <w:rFonts w:ascii="Arial" w:cs="Arial" w:eastAsia="Arial" w:hAnsi="Arial"/>
+                <w:b/>
+                <w:bCs/>
+                <w:color w:val="1F4E79"/>
+                <w:sz w:val="22"/>
+                <w:szCs w:val="22"/>
+              </w:rPr>
+              <w:t xml:space="preserve">15</w:t>
+            </w:r>
+          </w:p>
+        </w:tc>
+      </w:tr>
+      <w:tr>
+        <w:tc>
+          <w:tcPr>
+            <w:tcW w:type="dxa" w:w="9360"/>
+            <w:gridSpan w:val="2"/>
+            <w:tcBorders>
+              <w:top w:val="none" w:color="FFFFFF" w:sz="0"/>
+              <w:left w:val="none" w:color="FFFFFF" w:sz="0"/>
+              <w:bottom w:val="none" w:color="FFFFFF" w:sz="0"/>
+              <w:right w:val="none" w:color="FFFFFF" w:sz="0"/>
+            </w:tcBorders>
+            <w:tcMar>
+              <w:top w:type="dxa" w:w="0"/>
+              <w:left w:type="dxa" w:w="0"/>
+              <w:bottom w:type="dxa" w:w="0"/>
+              <w:right w:type="dxa" w:w="0"/>
+            </w:tcMar>
+          </w:tcPr>
+          <w:p>
+            <w:pPr>
+              <w:spacing w:after="0" w:before="0"/>
+            </w:pPr>
+            <w:r>
+              <w:t xml:space="preserve"/>
+            </w:r>
+          </w:p>
+        </w:tc>
+      </w:tr>
+      <w:tr>
+        <w:tc>
+          <w:tcPr>
+            <w:tcW w:type="dxa" w:w="9360"/>
+            <w:gridSpan w:val="2"/>
+            <w:tcBorders>
+              <w:top w:val="none" w:color="FFFFFF" w:sz="0"/>
+              <w:left w:val="none" w:color="FFFFFF" w:sz="0"/>
+              <w:bottom w:val="none" w:color="FFFFFF" w:sz="0"/>
+              <w:right w:val="none" w:color="FFFFFF" w:sz="0"/>
+            </w:tcBorders>
+            <w:shd w:fill="1F4E79" w:val="clear"/>
+            <w:tcMar>
+              <w:top w:type="dxa" w:w="120"/>
+              <w:left w:type="dxa" w:w="120"/>
+              <w:bottom w:type="dxa" w:w="120"/>
+              <w:right w:type="dxa" w:w="120"/>
+            </w:tcMar>
+          </w:tcPr>
+          <w:p>
+            <w:r>
+              <w:rPr>
+                <w:rFonts w:ascii="Arial" w:cs="Arial" w:eastAsia="Arial" w:hAnsi="Arial"/>
+                <w:b/>
+                <w:bCs/>
+                <w:caps/>
+                <w:color w:val="FFFFFF"/>
+                <w:sz w:val="19"/>
+                <w:szCs w:val="19"/>
+              </w:rPr>
+              <w:t xml:space="preserve">Part Two  —  AI in Your Everyday Life: Your New Superpowers</w:t>
+            </w:r>
+          </w:p>
+        </w:tc>
+      </w:tr>
+      <w:tr>
+        <w:tc>
+          <w:tcPr>
+            <w:tcW w:type="dxa" w:w="8200"/>
+            <w:tcBorders>
+              <w:top w:val="none" w:color="FFFFFF" w:sz="0"/>
+              <w:left w:val="none" w:color="FFFFFF" w:sz="0"/>
+              <w:bottom w:val="none" w:color="FFFFFF" w:sz="0"/>
+              <w:right w:val="none" w:color="FFFFFF" w:sz="0"/>
+            </w:tcBorders>
+            <w:tcMar>
+              <w:top w:type="dxa" w:w="100"/>
+              <w:left w:type="dxa" w:w="0"/>
+              <w:bottom w:type="dxa" w:w="100"/>
+              <w:right w:type="dxa" w:w="120"/>
+            </w:tcMar>
+          </w:tcPr>
+          <w:p>
+            <w:r>
+              <w:rPr>
+                <w:rFonts w:ascii="Arial" w:cs="Arial" w:eastAsia="Arial" w:hAnsi="Arial"/>
+                <w:b/>
+                <w:bCs/>
+                <w:color w:val="1A1A2E"/>
+                <w:sz w:val="22"/>
+                <w:szCs w:val="22"/>
+              </w:rPr>
+              <w:t xml:space="preserve">Chapter 4   AI at Work: Earning Back Your Time</w:t>
+            </w:r>
+          </w:p>
+        </w:tc>
+        <w:tc>
+          <w:tcPr>
+            <w:tcW w:type="dxa" w:w="1160"/>
+            <w:tcBorders>
+              <w:top w:val="none" w:color="FFFFFF" w:sz="0"/>
+              <w:left w:val="none" w:color="FFFFFF" w:sz="0"/>
+              <w:bottom w:val="none" w:color="FFFFFF" w:sz="0"/>
+              <w:right w:val="none" w:color="FFFFFF" w:sz="0"/>
+            </w:tcBorders>
+            <w:tcMar>
+              <w:top w:type="dxa" w:w="100"/>
+              <w:left w:type="dxa" w:w="0"/>
+              <w:bottom w:type="dxa" w:w="100"/>
+              <w:right w:type="dxa" w:w="0"/>
+            </w:tcMar>
+          </w:tcPr>
+          <w:p>
+            <w:pPr>
+              <w:jc w:val="right"/>
+            </w:pPr>
+            <w:r>
+              <w:rPr>
+                <w:rFonts w:ascii="Arial" w:cs="Arial" w:eastAsia="Arial" w:hAnsi="Arial"/>
+                <w:b/>
+                <w:bCs/>
+                <w:color w:val="1F4E79"/>
+                <w:sz w:val="22"/>
+                <w:szCs w:val="22"/>
+              </w:rPr>
+              <w:t xml:space="preserve">19</w:t>
+            </w:r>
+          </w:p>
+        </w:tc>
+      </w:tr>
+      <w:tr>
+        <w:tc>
+          <w:tcPr>
+            <w:tcW w:type="dxa" w:w="8200"/>
+            <w:tcBorders>
+              <w:top w:val="none" w:color="FFFFFF" w:sz="0"/>
+              <w:left w:val="none" w:color="FFFFFF" w:sz="0"/>
+              <w:bottom w:val="none" w:color="FFFFFF" w:sz="0"/>
+              <w:right w:val="none" w:color="FFFFFF" w:sz="0"/>
+            </w:tcBorders>
+            <w:tcMar>
+              <w:top w:type="dxa" w:w="100"/>
+              <w:left w:type="dxa" w:w="0"/>
+              <w:bottom w:type="dxa" w:w="100"/>
+              <w:right w:type="dxa" w:w="120"/>
+            </w:tcMar>
+          </w:tcPr>
+          <w:p>
+            <w:r>
+              <w:rPr>
+                <w:rFonts w:ascii="Arial" w:cs="Arial" w:eastAsia="Arial" w:hAnsi="Arial"/>
+                <w:b/>
+                <w:bCs/>
+                <w:color w:val="1A1A2E"/>
+                <w:sz w:val="22"/>
+                <w:szCs w:val="22"/>
+              </w:rPr>
+              <w:t xml:space="preserve">Chapter 5   AI at Home: The Ultimate Personal Assistant</w:t>
+            </w:r>
+          </w:p>
+        </w:tc>
+        <w:tc>
+          <w:tcPr>
+            <w:tcW w:type="dxa" w:w="1160"/>
+            <w:tcBorders>
+              <w:top w:val="none" w:color="FFFFFF" w:sz="0"/>
+              <w:left w:val="none" w:color="FFFFFF" w:sz="0"/>
+              <w:bottom w:val="none" w:color="FFFFFF" w:sz="0"/>
+              <w:right w:val="none" w:color="FFFFFF" w:sz="0"/>
+            </w:tcBorders>
+            <w:tcMar>
+              <w:top w:type="dxa" w:w="100"/>
+              <w:left w:type="dxa" w:w="0"/>
+              <w:bottom w:type="dxa" w:w="100"/>
+              <w:right w:type="dxa" w:w="0"/>
+            </w:tcMar>
+          </w:tcPr>
+          <w:p>
+            <w:pPr>
+              <w:jc w:val="right"/>
+            </w:pPr>
+            <w:r>
+              <w:rPr>
+                <w:rFonts w:ascii="Arial" w:cs="Arial" w:eastAsia="Arial" w:hAnsi="Arial"/>
+                <w:b/>
+                <w:bCs/>
+                <w:color w:val="1F4E79"/>
+                <w:sz w:val="22"/>
+                <w:szCs w:val="22"/>
+              </w:rPr>
+              <w:t xml:space="preserve">24</w:t>
+            </w:r>
+          </w:p>
+        </w:tc>
+      </w:tr>
+      <w:tr>
+        <w:tc>
+          <w:tcPr>
+            <w:tcW w:type="dxa" w:w="8200"/>
+            <w:tcBorders>
+              <w:top w:val="none" w:color="FFFFFF" w:sz="0"/>
+              <w:left w:val="none" w:color="FFFFFF" w:sz="0"/>
+              <w:bottom w:val="none" w:color="FFFFFF" w:sz="0"/>
+              <w:right w:val="none" w:color="FFFFFF" w:sz="0"/>
+            </w:tcBorders>
+            <w:tcMar>
+              <w:top w:type="dxa" w:w="100"/>
+              <w:left w:type="dxa" w:w="0"/>
+              <w:bottom w:type="dxa" w:w="100"/>
+              <w:right w:type="dxa" w:w="120"/>
+            </w:tcMar>
+          </w:tcPr>
+          <w:p>
+            <w:r>
+              <w:rPr>
+                <w:rFonts w:ascii="Arial" w:cs="Arial" w:eastAsia="Arial" w:hAnsi="Arial"/>
+                <w:b/>
+                <w:bCs/>
+                <w:color w:val="1A1A2E"/>
+                <w:sz w:val="22"/>
+                <w:szCs w:val="22"/>
+              </w:rPr>
+              <w:t xml:space="preserve">Chapter 6   Unleashing Your Creativity (Even if You Aren't Creative)</w:t>
+            </w:r>
+          </w:p>
+        </w:tc>
+        <w:tc>
+          <w:tcPr>
+            <w:tcW w:type="dxa" w:w="1160"/>
+            <w:tcBorders>
+              <w:top w:val="none" w:color="FFFFFF" w:sz="0"/>
+              <w:left w:val="none" w:color="FFFFFF" w:sz="0"/>
+              <w:bottom w:val="none" w:color="FFFFFF" w:sz="0"/>
+              <w:right w:val="none" w:color="FFFFFF" w:sz="0"/>
+            </w:tcBorders>
+            <w:tcMar>
+              <w:top w:type="dxa" w:w="100"/>
+              <w:left w:type="dxa" w:w="0"/>
+              <w:bottom w:type="dxa" w:w="100"/>
+              <w:right w:type="dxa" w:w="0"/>
+            </w:tcMar>
+          </w:tcPr>
+          <w:p>
+            <w:pPr>
+              <w:jc w:val="right"/>
+            </w:pPr>
+            <w:r>
+              <w:rPr>
+                <w:rFonts w:ascii="Arial" w:cs="Arial" w:eastAsia="Arial" w:hAnsi="Arial"/>
+                <w:b/>
+                <w:bCs/>
+                <w:color w:val="1F4E79"/>
+                <w:sz w:val="22"/>
+                <w:szCs w:val="22"/>
+              </w:rPr>
+              <w:t xml:space="preserve">28</w:t>
+            </w:r>
+          </w:p>
+        </w:tc>
+      </w:tr>
+      <w:tr>
+        <w:tc>
+          <w:tcPr>
+            <w:tcW w:type="dxa" w:w="8200"/>
+            <w:tcBorders>
+              <w:top w:val="none" w:color="FFFFFF" w:sz="0"/>
+              <w:left w:val="none" w:color="FFFFFF" w:sz="0"/>
+              <w:bottom w:val="none" w:color="FFFFFF" w:sz="0"/>
+              <w:right w:val="none" w:color="FFFFFF" w:sz="0"/>
+            </w:tcBorders>
+            <w:tcMar>
+              <w:top w:type="dxa" w:w="100"/>
+              <w:left w:type="dxa" w:w="0"/>
+              <w:bottom w:type="dxa" w:w="100"/>
+              <w:right w:type="dxa" w:w="120"/>
+            </w:tcMar>
+          </w:tcPr>
+          <w:p>
+            <w:r>
+              <w:rPr>
+                <w:rFonts w:ascii="Arial" w:cs="Arial" w:eastAsia="Arial" w:hAnsi="Arial"/>
+                <w:b/>
+                <w:bCs/>
+                <w:color w:val="1A1A2E"/>
+                <w:sz w:val="22"/>
+                <w:szCs w:val="22"/>
+              </w:rPr>
+              <w:t xml:space="preserve">Chapter 7   Health, Learning, and Personal Growth</w:t>
+            </w:r>
+          </w:p>
+        </w:tc>
+        <w:tc>
+          <w:tcPr>
+            <w:tcW w:type="dxa" w:w="1160"/>
+            <w:tcBorders>
+              <w:top w:val="none" w:color="FFFFFF" w:sz="0"/>
+              <w:left w:val="none" w:color="FFFFFF" w:sz="0"/>
+              <w:bottom w:val="none" w:color="FFFFFF" w:sz="0"/>
+              <w:right w:val="none" w:color="FFFFFF" w:sz="0"/>
+            </w:tcBorders>
+            <w:tcMar>
+              <w:top w:type="dxa" w:w="100"/>
+              <w:left w:type="dxa" w:w="0"/>
+              <w:bottom w:type="dxa" w:w="100"/>
+              <w:right w:type="dxa" w:w="0"/>
+            </w:tcMar>
+          </w:tcPr>
+          <w:p>
+            <w:pPr>
+              <w:jc w:val="right"/>
+            </w:pPr>
+            <w:r>
+              <w:rPr>
+                <w:rFonts w:ascii="Arial" w:cs="Arial" w:eastAsia="Arial" w:hAnsi="Arial"/>
+                <w:b/>
+                <w:bCs/>
+                <w:color w:val="1F4E79"/>
+                <w:sz w:val="22"/>
+                <w:szCs w:val="22"/>
+              </w:rPr>
+              <w:t xml:space="preserve">32</w:t>
+            </w:r>
+          </w:p>
+        </w:tc>
+      </w:tr>
+      <w:tr>
+        <w:tc>
+          <w:tcPr>
+            <w:tcW w:type="dxa" w:w="9360"/>
+            <w:gridSpan w:val="2"/>
+            <w:tcBorders>
+              <w:top w:val="none" w:color="FFFFFF" w:sz="0"/>
+              <w:left w:val="none" w:color="FFFFFF" w:sz="0"/>
+              <w:bottom w:val="none" w:color="FFFFFF" w:sz="0"/>
+              <w:right w:val="none" w:color="FFFFFF" w:sz="0"/>
+            </w:tcBorders>
+            <w:tcMar>
+              <w:top w:type="dxa" w:w="0"/>
+              <w:left w:type="dxa" w:w="0"/>
+              <w:bottom w:type="dxa" w:w="0"/>
+              <w:right w:type="dxa" w:w="0"/>
+            </w:tcMar>
+          </w:tcPr>
+          <w:p>
+            <w:pPr>
+              <w:spacing w:after="0" w:before="0"/>
+            </w:pPr>
+            <w:r>
+              <w:t xml:space="preserve"/>
+            </w:r>
+          </w:p>
+        </w:tc>
+      </w:tr>
+      <w:tr>
+        <w:tc>
+          <w:tcPr>
+            <w:tcW w:type="dxa" w:w="9360"/>
+            <w:gridSpan w:val="2"/>
+            <w:tcBorders>
+              <w:top w:val="none" w:color="FFFFFF" w:sz="0"/>
+              <w:left w:val="none" w:color="FFFFFF" w:sz="0"/>
+              <w:bottom w:val="none" w:color="FFFFFF" w:sz="0"/>
+              <w:right w:val="none" w:color="FFFFFF" w:sz="0"/>
+            </w:tcBorders>
+            <w:shd w:fill="1F4E79" w:val="clear"/>
+            <w:tcMar>
+              <w:top w:type="dxa" w:w="120"/>
+              <w:left w:type="dxa" w:w="120"/>
+              <w:bottom w:type="dxa" w:w="120"/>
+              <w:right w:type="dxa" w:w="120"/>
+            </w:tcMar>
+          </w:tcPr>
+          <w:p>
+            <w:r>
+              <w:rPr>
+                <w:rFonts w:ascii="Arial" w:cs="Arial" w:eastAsia="Arial" w:hAnsi="Arial"/>
+                <w:b/>
+                <w:bCs/>
+                <w:caps/>
+                <w:color w:val="FFFFFF"/>
+                <w:sz w:val="19"/>
+                <w:szCs w:val="19"/>
+              </w:rPr>
+              <w:t xml:space="preserve">Part Three  —  Navigating the Future: Living Safely with AI</w:t>
+            </w:r>
+          </w:p>
+        </w:tc>
+      </w:tr>
+      <w:tr>
+        <w:tc>
+          <w:tcPr>
+            <w:tcW w:type="dxa" w:w="8200"/>
+            <w:tcBorders>
+              <w:top w:val="none" w:color="FFFFFF" w:sz="0"/>
+              <w:left w:val="none" w:color="FFFFFF" w:sz="0"/>
+              <w:bottom w:val="none" w:color="FFFFFF" w:sz="0"/>
+              <w:right w:val="none" w:color="FFFFFF" w:sz="0"/>
+            </w:tcBorders>
+            <w:tcMar>
+              <w:top w:type="dxa" w:w="100"/>
+              <w:left w:type="dxa" w:w="0"/>
+              <w:bottom w:type="dxa" w:w="100"/>
+              <w:right w:type="dxa" w:w="120"/>
+            </w:tcMar>
+          </w:tcPr>
+          <w:p>
+            <w:r>
+              <w:rPr>
+                <w:rFonts w:ascii="Arial" w:cs="Arial" w:eastAsia="Arial" w:hAnsi="Arial"/>
+                <w:b/>
+                <w:bCs/>
+                <w:color w:val="1A1A2E"/>
+                <w:sz w:val="22"/>
+                <w:szCs w:val="22"/>
+              </w:rPr>
+              <w:t xml:space="preserve">Chapter 8   The Elephant in the Room: Deepfakes, Privacy, and Bias</w:t>
+            </w:r>
+          </w:p>
+        </w:tc>
+        <w:tc>
+          <w:tcPr>
+            <w:tcW w:type="dxa" w:w="1160"/>
+            <w:tcBorders>
+              <w:top w:val="none" w:color="FFFFFF" w:sz="0"/>
+              <w:left w:val="none" w:color="FFFFFF" w:sz="0"/>
+              <w:bottom w:val="none" w:color="FFFFFF" w:sz="0"/>
+              <w:right w:val="none" w:color="FFFFFF" w:sz="0"/>
+            </w:tcBorders>
+            <w:tcMar>
+              <w:top w:type="dxa" w:w="100"/>
+              <w:left w:type="dxa" w:w="0"/>
+              <w:bottom w:type="dxa" w:w="100"/>
+              <w:right w:type="dxa" w:w="0"/>
+            </w:tcMar>
+          </w:tcPr>
+          <w:p>
+            <w:pPr>
+              <w:jc w:val="right"/>
+            </w:pPr>
+            <w:r>
+              <w:rPr>
+                <w:rFonts w:ascii="Arial" w:cs="Arial" w:eastAsia="Arial" w:hAnsi="Arial"/>
+                <w:b/>
+                <w:bCs/>
+                <w:color w:val="1F4E79"/>
+                <w:sz w:val="22"/>
+                <w:szCs w:val="22"/>
+              </w:rPr>
+              <w:t xml:space="preserve">36</w:t>
+            </w:r>
+          </w:p>
+        </w:tc>
+      </w:tr>
+      <w:tr>
+        <w:tc>
+          <w:tcPr>
+            <w:tcW w:type="dxa" w:w="8200"/>
+            <w:tcBorders>
+              <w:top w:val="none" w:color="FFFFFF" w:sz="0"/>
+              <w:left w:val="none" w:color="FFFFFF" w:sz="0"/>
+              <w:bottom w:val="none" w:color="FFFFFF" w:sz="0"/>
+              <w:right w:val="none" w:color="FFFFFF" w:sz="0"/>
+            </w:tcBorders>
+            <w:tcMar>
+              <w:top w:type="dxa" w:w="100"/>
+              <w:left w:type="dxa" w:w="0"/>
+              <w:bottom w:type="dxa" w:w="100"/>
+              <w:right w:type="dxa" w:w="120"/>
+            </w:tcMar>
+          </w:tcPr>
+          <w:p>
+            <w:r>
+              <w:rPr>
+                <w:rFonts w:ascii="Arial" w:cs="Arial" w:eastAsia="Arial" w:hAnsi="Arial"/>
+                <w:b/>
+                <w:bCs/>
+                <w:color w:val="1A1A2E"/>
+                <w:sz w:val="22"/>
+                <w:szCs w:val="22"/>
+              </w:rPr>
+              <w:t xml:space="preserve">Chapter 9   What's Next? The Future of Human-AI Collaboration</w:t>
+            </w:r>
+          </w:p>
+        </w:tc>
+        <w:tc>
+          <w:tcPr>
+            <w:tcW w:type="dxa" w:w="1160"/>
+            <w:tcBorders>
+              <w:top w:val="none" w:color="FFFFFF" w:sz="0"/>
+              <w:left w:val="none" w:color="FFFFFF" w:sz="0"/>
+              <w:bottom w:val="none" w:color="FFFFFF" w:sz="0"/>
+              <w:right w:val="none" w:color="FFFFFF" w:sz="0"/>
+            </w:tcBorders>
+            <w:tcMar>
+              <w:top w:type="dxa" w:w="100"/>
+              <w:left w:type="dxa" w:w="0"/>
+              <w:bottom w:type="dxa" w:w="100"/>
+              <w:right w:type="dxa" w:w="0"/>
+            </w:tcMar>
+          </w:tcPr>
+          <w:p>
+            <w:pPr>
+              <w:jc w:val="right"/>
+            </w:pPr>
+            <w:r>
+              <w:rPr>
+                <w:rFonts w:ascii="Arial" w:cs="Arial" w:eastAsia="Arial" w:hAnsi="Arial"/>
+                <w:b/>
+                <w:bCs/>
+                <w:color w:val="1F4E79"/>
+                <w:sz w:val="22"/>
+                <w:szCs w:val="22"/>
+              </w:rPr>
+              <w:t xml:space="preserve">40</w:t>
+            </w:r>
+          </w:p>
+        </w:tc>
+      </w:tr>
+      <w:tr>
+        <w:tc>
+          <w:tcPr>
+            <w:tcW w:type="dxa" w:w="8200"/>
+            <w:tcBorders>
+              <w:top w:val="none" w:color="FFFFFF" w:sz="0"/>
+              <w:left w:val="none" w:color="FFFFFF" w:sz="0"/>
+              <w:bottom w:val="none" w:color="FFFFFF" w:sz="0"/>
+              <w:right w:val="none" w:color="FFFFFF" w:sz="0"/>
+            </w:tcBorders>
+            <w:tcMar>
+              <w:top w:type="dxa" w:w="100"/>
+              <w:left w:type="dxa" w:w="0"/>
+              <w:bottom w:type="dxa" w:w="100"/>
+              <w:right w:type="dxa" w:w="120"/>
+            </w:tcMar>
+          </w:tcPr>
+          <w:p>
+            <w:r>
+              <w:rPr>
+                <w:rFonts w:ascii="Arial" w:cs="Arial" w:eastAsia="Arial" w:hAnsi="Arial"/>
+                <w:b/>
+                <w:bCs/>
+                <w:color w:val="1A1A2E"/>
+                <w:sz w:val="22"/>
+                <w:szCs w:val="22"/>
+              </w:rPr>
+              <w:t xml:space="preserve">Chapter 10   Your AI Action Plan: Start Here Today</w:t>
+            </w:r>
+          </w:p>
+        </w:tc>
+        <w:tc>
+          <w:tcPr>
+            <w:tcW w:type="dxa" w:w="1160"/>
+            <w:tcBorders>
+              <w:top w:val="none" w:color="FFFFFF" w:sz="0"/>
+              <w:left w:val="none" w:color="FFFFFF" w:sz="0"/>
+              <w:bottom w:val="none" w:color="FFFFFF" w:sz="0"/>
+              <w:right w:val="none" w:color="FFFFFF" w:sz="0"/>
+            </w:tcBorders>
+            <w:tcMar>
+              <w:top w:type="dxa" w:w="100"/>
+              <w:left w:type="dxa" w:w="0"/>
+              <w:bottom w:type="dxa" w:w="100"/>
+              <w:right w:type="dxa" w:w="0"/>
+            </w:tcMar>
+          </w:tcPr>
+          <w:p>
+            <w:pPr>
+              <w:jc w:val="right"/>
+            </w:pPr>
+            <w:r>
+              <w:rPr>
+                <w:rFonts w:ascii="Arial" w:cs="Arial" w:eastAsia="Arial" w:hAnsi="Arial"/>
+                <w:b/>
+                <w:bCs/>
+                <w:color w:val="1F4E79"/>
+                <w:sz w:val="22"/>
+                <w:szCs w:val="22"/>
+              </w:rPr>
+              <w:t xml:space="preserve">45</w:t>
+            </w:r>
+          </w:p>
+        </w:tc>
+      </w:tr>
+      <w:tr>
+        <w:tc>
+          <w:tcPr>
+            <w:tcW w:type="dxa" w:w="9360"/>
+            <w:gridSpan w:val="2"/>
+            <w:tcBorders>
+              <w:top w:val="none" w:color="FFFFFF" w:sz="0"/>
+              <w:left w:val="none" w:color="FFFFFF" w:sz="0"/>
+              <w:bottom w:val="none" w:color="FFFFFF" w:sz="0"/>
+              <w:right w:val="none" w:color="FFFFFF" w:sz="0"/>
+            </w:tcBorders>
+            <w:tcMar>
+              <w:top w:type="dxa" w:w="0"/>
+              <w:left w:type="dxa" w:w="0"/>
+              <w:bottom w:type="dxa" w:w="0"/>
+              <w:right w:type="dxa" w:w="0"/>
+            </w:tcMar>
+          </w:tcPr>
+          <w:p>
+            <w:pPr>
+              <w:spacing w:after="0" w:before="0"/>
+            </w:pPr>
+            <w:r>
+              <w:t xml:space="preserve"/>
+            </w:r>
+          </w:p>
+        </w:tc>
+      </w:tr>
+      <w:tr>
+        <w:tc>
+          <w:tcPr>
+            <w:tcW w:type="dxa" w:w="9360"/>
+            <w:gridSpan w:val="2"/>
+            <w:tcBorders>
+              <w:top w:val="none" w:color="FFFFFF" w:sz="0"/>
+              <w:left w:val="none" w:color="FFFFFF" w:sz="0"/>
+              <w:bottom w:val="none" w:color="FFFFFF" w:sz="0"/>
+              <w:right w:val="none" w:color="FFFFFF" w:sz="0"/>
+            </w:tcBorders>
+            <w:shd w:fill="1F4E79" w:val="clear"/>
+            <w:tcMar>
+              <w:top w:type="dxa" w:w="120"/>
+              <w:left w:type="dxa" w:w="120"/>
+              <w:bottom w:type="dxa" w:w="120"/>
+              <w:right w:type="dxa" w:w="120"/>
+            </w:tcMar>
+          </w:tcPr>
+          <w:p>
+            <w:r>
+              <w:rPr>
+                <w:rFonts w:ascii="Arial" w:cs="Arial" w:eastAsia="Arial" w:hAnsi="Arial"/>
+                <w:b/>
+                <w:bCs/>
+                <w:caps/>
+                <w:color w:val="FFFFFF"/>
+                <w:sz w:val="19"/>
+                <w:szCs w:val="19"/>
+              </w:rPr>
+              <w:t xml:space="preserve">Appendix</w:t>
+            </w:r>
+          </w:p>
+        </w:tc>
+      </w:tr>
+      <w:tr>
+        <w:tc>
+          <w:tcPr>
+            <w:tcW w:type="dxa" w:w="8200"/>
+            <w:tcBorders>
+              <w:top w:val="none" w:color="FFFFFF" w:sz="0"/>
+              <w:left w:val="none" w:color="FFFFFF" w:sz="0"/>
+              <w:bottom w:val="none" w:color="FFFFFF" w:sz="0"/>
+              <w:right w:val="none" w:color="FFFFFF" w:sz="0"/>
+            </w:tcBorders>
+            <w:tcMar>
+              <w:top w:type="dxa" w:w="60"/>
+              <w:left w:type="dxa" w:w="360"/>
+              <w:bottom w:type="dxa" w:w="60"/>
+              <w:right w:type="dxa" w:w="120"/>
+            </w:tcMar>
+          </w:tcPr>
+          <w:p>
+            <w:r>
+              <w:rPr>
+                <w:rFonts w:ascii="Georgia" w:cs="Georgia" w:eastAsia="Georgia" w:hAnsi="Georgia"/>
+                <w:b w:val="false"/>
+                <w:bCs w:val="false"/>
+                <w:color w:val="555555"/>
+                <w:sz w:val="20"/>
+                <w:szCs w:val="20"/>
+              </w:rPr>
+              <w:t xml:space="preserve">Quick Reference Prompt Guide</w:t>
+            </w:r>
+          </w:p>
+        </w:tc>
+        <w:tc>
+          <w:tcPr>
+            <w:tcW w:type="dxa" w:w="1160"/>
+            <w:tcBorders>
+              <w:top w:val="none" w:color="FFFFFF" w:sz="0"/>
+              <w:left w:val="none" w:color="FFFFFF" w:sz="0"/>
+              <w:bottom w:val="none" w:color="FFFFFF" w:sz="0"/>
+              <w:right w:val="none" w:color="FFFFFF" w:sz="0"/>
+            </w:tcBorders>
+            <w:tcMar>
+              <w:top w:type="dxa" w:w="60"/>
+              <w:left w:type="dxa" w:w="0"/>
+              <w:bottom w:type="dxa" w:w="60"/>
+              <w:right w:type="dxa" w:w="0"/>
+            </w:tcMar>
+          </w:tcPr>
+          <w:p>
+            <w:pPr>
+              <w:jc w:val="right"/>
+            </w:pPr>
+            <w:r>
+              <w:rPr>
+                <w:rFonts w:ascii="Arial" w:cs="Arial" w:eastAsia="Arial" w:hAnsi="Arial"/>
+                <w:b w:val="false"/>
+                <w:bCs w:val="false"/>
+                <w:color w:val="777777"/>
+                <w:sz w:val="20"/>
+                <w:szCs w:val="20"/>
+              </w:rPr>
+              <w:t xml:space="preserve">50</w:t>
+            </w:r>
+          </w:p>
+        </w:tc>
+      </w:tr>
+    </w:tbl>
     <w:p>
       <w:pPr>
         <w:pStyle w:val="Heading1"/>

</xml_diff>

<commit_message>
Fix: Introduction starts on a new page after TOC
</commit_message>
<xml_diff>
--- a/AI_for_Everyone_by_Alok_Maurya.docx
+++ b/AI_for_Everyone_by_Alok_Maurya.docx
@@ -1190,6 +1190,14 @@
     </w:tbl>
     <w:p>
       <w:pPr>
+        <w:spacing w:after="0" w:before="0"/>
+      </w:pPr>
+      <w:r>
+        <w:br w:type="page"/>
+      </w:r>
+    </w:p>
+    <w:p>
+      <w:pPr>
         <w:pStyle w:val="Heading1"/>
         <w:pBdr>
           <w:bottom w:val="single" w:color="1F4E79" w:sz="8" w:space="12"/>

</xml_diff>